<commit_message>
modified:   docs/SOFTWARE_REQUIREMENTS_SPECIFICATION_(SRS).docx 	modified:   frontend/src/components/FormInput.tsx 	modified:   frontend/src/components/FormTextarea.tsx 	modified:   frontend/src/pages/landlord/NewPropertyForm.tsx
</commit_message>
<xml_diff>
--- a/docs/SOFTWARE_REQUIREMENTS_SPECIFICATION_(SRS).docx
+++ b/docs/SOFTWARE_REQUIREMENTS_SPECIFICATION_(SRS).docx
@@ -15,15 +15,7 @@
         <w:pStyle w:val="MdHeading2"/>
       </w:pPr>
       <w:r>
-        <w:t xml:space="preserve">Project: </w:t>
-      </w:r>
-      <w:proofErr w:type="spellStart"/>
-      <w:r>
-        <w:t>LodgeMe</w:t>
-      </w:r>
-      <w:proofErr w:type="spellEnd"/>
-      <w:r>
-        <w:t xml:space="preserve"> (Cameroon Edition)</w:t>
+        <w:t>Project: LodgeMe (Cameroon Edition)</w:t>
       </w:r>
     </w:p>
     <w:p>
@@ -113,14 +105,12 @@
       <w:r>
         <w:t xml:space="preserve">The purpose of this document is to provide a comprehensive description of the </w:t>
       </w:r>
-      <w:proofErr w:type="spellStart"/>
       <w:r>
         <w:rPr>
           <w:rStyle w:val="MdStrong"/>
         </w:rPr>
         <w:t>LodgeMe</w:t>
       </w:r>
-      <w:proofErr w:type="spellEnd"/>
       <w:r>
         <w:t xml:space="preserve"> system. It defines the functional and non-functional requirements, system architecture, and design constraints. This document is intended for developers, project managers, academic supervisors, and stakeholders involved in the development and evaluation of the system.</w:t>
       </w:r>
@@ -143,14 +133,12 @@
       <w:pPr>
         <w:pStyle w:val="MdParagraph"/>
       </w:pPr>
-      <w:proofErr w:type="spellStart"/>
       <w:r>
         <w:rPr>
           <w:rStyle w:val="MdStrong"/>
         </w:rPr>
         <w:t>LodgeMe</w:t>
       </w:r>
-      <w:proofErr w:type="spellEnd"/>
       <w:r>
         <w:t xml:space="preserve"> is a web-based rental marketplace and property management system tailored for the Cameroonian market. </w:t>
       </w:r>
@@ -170,15 +158,13 @@
         <w:t>What the system will do</w:t>
       </w:r>
       <w:r>
-        <w:t>: Facilitate property discovery through a public marketplace, allow landlords to manage "</w:t>
-      </w:r>
-      <w:proofErr w:type="spellStart"/>
-      <w:r>
-        <w:t>minicités</w:t>
-      </w:r>
-      <w:proofErr w:type="spellEnd"/>
-      <w:r>
-        <w:t>" and rooms, automate rent invoicing, provide digital receipting for offline payments, and enable maintenance tracking.</w:t>
+        <w:t>: Facilitate property discovery through a public marketplace, allow landlords to manage "minicités" and rooms</w:t>
+      </w:r>
+      <w:r>
+        <w:t>, apartments</w:t>
+      </w:r>
+      <w:r>
+        <w:t>, automate rent invoicing, provide digital receipting for offline payments, and enable maintenance tracking.</w:t>
       </w:r>
     </w:p>
     <w:p>
@@ -233,12 +219,6 @@
         <w:gridCol w:w="7516"/>
       </w:tblGrid>
       <w:tr>
-        <w:tblPrEx>
-          <w:tblCellMar>
-            <w:top w:w="0" w:type="dxa"/>
-            <w:bottom w:w="0" w:type="dxa"/>
-          </w:tblCellMar>
-        </w:tblPrEx>
         <w:trPr>
           <w:cantSplit/>
           <w:trHeight w:val="720"/>
@@ -286,12 +266,6 @@
         </w:tc>
       </w:tr>
       <w:tr>
-        <w:tblPrEx>
-          <w:tblCellMar>
-            <w:top w:w="0" w:type="dxa"/>
-            <w:bottom w:w="0" w:type="dxa"/>
-          </w:tblCellMar>
-        </w:tblPrEx>
         <w:trPr>
           <w:cantSplit/>
           <w:trHeight w:val="576"/>
@@ -341,12 +315,6 @@
         </w:tc>
       </w:tr>
       <w:tr>
-        <w:tblPrEx>
-          <w:tblCellMar>
-            <w:top w:w="0" w:type="dxa"/>
-            <w:bottom w:w="0" w:type="dxa"/>
-          </w:tblCellMar>
-        </w:tblPrEx>
         <w:trPr>
           <w:cantSplit/>
           <w:trHeight w:val="576"/>
@@ -396,12 +364,6 @@
         </w:tc>
       </w:tr>
       <w:tr>
-        <w:tblPrEx>
-          <w:tblCellMar>
-            <w:top w:w="0" w:type="dxa"/>
-            <w:bottom w:w="0" w:type="dxa"/>
-          </w:tblCellMar>
-        </w:tblPrEx>
         <w:trPr>
           <w:cantSplit/>
           <w:trHeight w:val="576"/>
@@ -452,12 +414,6 @@
         </w:tc>
       </w:tr>
       <w:tr>
-        <w:tblPrEx>
-          <w:tblCellMar>
-            <w:top w:w="0" w:type="dxa"/>
-            <w:bottom w:w="0" w:type="dxa"/>
-          </w:tblCellMar>
-        </w:tblPrEx>
         <w:trPr>
           <w:cantSplit/>
           <w:trHeight w:val="576"/>
@@ -477,14 +433,12 @@
             <w:pPr>
               <w:pStyle w:val="MdTableCell"/>
             </w:pPr>
-            <w:proofErr w:type="spellStart"/>
             <w:r>
               <w:rPr>
                 <w:rStyle w:val="MdStrong"/>
               </w:rPr>
               <w:t>MoMo</w:t>
             </w:r>
-            <w:proofErr w:type="spellEnd"/>
           </w:p>
         </w:tc>
         <w:tc>
@@ -509,12 +463,6 @@
         </w:tc>
       </w:tr>
       <w:tr>
-        <w:tblPrEx>
-          <w:tblCellMar>
-            <w:top w:w="0" w:type="dxa"/>
-            <w:bottom w:w="0" w:type="dxa"/>
-          </w:tblCellMar>
-        </w:tblPrEx>
         <w:trPr>
           <w:cantSplit/>
           <w:trHeight w:val="576"/>
@@ -680,14 +628,12 @@
       <w:pPr>
         <w:pStyle w:val="MdParagraph"/>
       </w:pPr>
-      <w:proofErr w:type="spellStart"/>
       <w:r>
         <w:rPr>
           <w:rStyle w:val="MdStrong"/>
         </w:rPr>
         <w:t>LodgeMe</w:t>
       </w:r>
-      <w:proofErr w:type="spellEnd"/>
       <w:r>
         <w:t xml:space="preserve"> is a standalone web application designed to replace manual, paper-based rental processes. It fits into the larger ecosystem of the Cameroonian digital economy by providing a trusted bridge between property owners and seekers.</w:t>
       </w:r>
@@ -831,12 +777,6 @@
         <w:gridCol w:w="7066"/>
       </w:tblGrid>
       <w:tr>
-        <w:tblPrEx>
-          <w:tblCellMar>
-            <w:top w:w="0" w:type="dxa"/>
-            <w:bottom w:w="0" w:type="dxa"/>
-          </w:tblCellMar>
-        </w:tblPrEx>
         <w:trPr>
           <w:cantSplit/>
           <w:trHeight w:val="720"/>
@@ -884,12 +824,6 @@
         </w:tc>
       </w:tr>
       <w:tr>
-        <w:tblPrEx>
-          <w:tblCellMar>
-            <w:top w:w="0" w:type="dxa"/>
-            <w:bottom w:w="0" w:type="dxa"/>
-          </w:tblCellMar>
-        </w:tblPrEx>
         <w:trPr>
           <w:cantSplit/>
           <w:trHeight w:val="576"/>
@@ -939,12 +873,6 @@
         </w:tc>
       </w:tr>
       <w:tr>
-        <w:tblPrEx>
-          <w:tblCellMar>
-            <w:top w:w="0" w:type="dxa"/>
-            <w:bottom w:w="0" w:type="dxa"/>
-          </w:tblCellMar>
-        </w:tblPrEx>
         <w:trPr>
           <w:cantSplit/>
           <w:trHeight w:val="576"/>
@@ -994,12 +922,6 @@
         </w:tc>
       </w:tr>
       <w:tr>
-        <w:tblPrEx>
-          <w:tblCellMar>
-            <w:top w:w="0" w:type="dxa"/>
-            <w:bottom w:w="0" w:type="dxa"/>
-          </w:tblCellMar>
-        </w:tblPrEx>
         <w:trPr>
           <w:cantSplit/>
           <w:trHeight w:val="576"/>
@@ -1284,15 +1206,7 @@
         <w:t>Inputs</w:t>
       </w:r>
       <w:r>
-        <w:t>: Location (</w:t>
-      </w:r>
-      <w:proofErr w:type="spellStart"/>
-      <w:r>
-        <w:t>Neighborhood</w:t>
-      </w:r>
-      <w:proofErr w:type="spellEnd"/>
-      <w:r>
-        <w:t>), Price Range, Property Type.</w:t>
+        <w:t>: Location (Neighborhood), Price Range, Property Type.</w:t>
       </w:r>
     </w:p>
     <w:p>
@@ -1397,7 +1311,13 @@
         <w:t>Processing</w:t>
       </w:r>
       <w:r>
-        <w:t>: Create a hierarchical structure (Minicité -&gt; Rooms).</w:t>
+        <w:t>: Create a hierarchical structure (Minicité -&gt; Rooms</w:t>
+      </w:r>
+      <w:r>
+        <w:t>, apartments</w:t>
+      </w:r>
+      <w:r>
+        <w:t>).</w:t>
       </w:r>
     </w:p>
     <w:p>
@@ -1818,15 +1738,7 @@
         </w:numPr>
       </w:pPr>
       <w:r>
-        <w:t xml:space="preserve">All passwords must be encrypted using </w:t>
-      </w:r>
-      <w:proofErr w:type="spellStart"/>
-      <w:r>
-        <w:t>Bcrypt</w:t>
-      </w:r>
-      <w:proofErr w:type="spellEnd"/>
-      <w:r>
-        <w:t>.</w:t>
+        <w:t>All passwords must be encrypted using Bcrypt.</w:t>
       </w:r>
     </w:p>
     <w:p>
@@ -1958,15 +1870,7 @@
         <w:t>Class Diagram</w:t>
       </w:r>
       <w:r>
-        <w:t xml:space="preserve">: Showing the relationship between </w:t>
-      </w:r>
-      <w:proofErr w:type="spellStart"/>
-      <w:r>
-        <w:t>Minicités</w:t>
-      </w:r>
-      <w:proofErr w:type="spellEnd"/>
-      <w:r>
-        <w:t>, Rooms, and Tenants.</w:t>
+        <w:t>: Showing the relationship between Minicités, Rooms, and Tenants.</w:t>
       </w:r>
     </w:p>
     <w:p>

</xml_diff>